<commit_message>
Add CSV to GeoPackage conversion script and batch file
- Implemented a Python script (csv_to_gpkg.py) to convert aerodrome data from CSV to GeoPackage format using pandas and geopandas.
- The script reads coordinates, handles missing values, and creates a GeoDataFrame before saving it as a GeoPackage.
- Added a batch file (run_csv_to_gpkg.bat) to facilitate running the conversion script with error handling and installation instructions for geopandas.
- Created a new GeoPackage file (ourairports-aerodromes.gpkg) to store the converted data.
</commit_message>
<xml_diff>
--- a/AIP Text Templates/AD2 Template (EADD Donlon).docx
+++ b/AIP Text Templates/AD2 Template (EADD Donlon).docx
@@ -1465,7 +1465,7 @@
               <w:rPr>
                 <w:lang w:val="en-US"/>
               </w:rPr>
-              <w:t xml:space="preserve">Name of aerodrome operator, address, telephone, telefax numbers, </w:t>
+              <w:t>Repair facilities for visiting aircraft</w:t>
             </w:r>
           </w:p>
         </w:tc>
@@ -1523,7 +1523,7 @@
               <w:rPr>
                 <w:lang w:val="en-US"/>
               </w:rPr>
-              <w:t>Types of traffic permitted (IFR/VFR)</w:t>
+              <w:t>Remarks</w:t>
             </w:r>
           </w:p>
         </w:tc>
@@ -1724,7 +1724,7 @@
               <w:pStyle w:val="TableRightColumn"/>
             </w:pPr>
             <w:r>
-              <w:t>1 truck 45 000 litres, 50 litres/sec.</w:t>
+              <w:t>Buses, taxis and car hire from the AD. Trains to and from the city.</w:t>
             </w:r>
           </w:p>
         </w:tc>
@@ -1774,7 +1774,7 @@
               <w:pStyle w:val="TableRightColumn"/>
             </w:pPr>
             <w:r>
-              <w:t>Available. See AD chart for location</w:t>
+              <w:t>First aid at AD. Hospitals in the city.</w:t>
             </w:r>
           </w:p>
         </w:tc>
@@ -1824,7 +1824,10 @@
               <w:pStyle w:val="TableRightColumn"/>
             </w:pPr>
             <w:r>
-              <w:t>Limited, by prior arrangement only.</w:t>
+              <w:t>At AD. Open within AD HR</w:t>
+            </w:r>
+            <w:r>
+              <w:t>.</w:t>
             </w:r>
           </w:p>
         </w:tc>
@@ -1874,7 +1877,7 @@
               <w:pStyle w:val="TableRightColumn"/>
             </w:pPr>
             <w:r>
-              <w:t>Available for aircraft up to 5 700 KG. Major repairs by</w:t>
+              <w:t>Office in the city.</w:t>
             </w:r>
           </w:p>
           <w:p>
@@ -1882,7 +1885,15 @@
               <w:pStyle w:val="TableRightColumn"/>
             </w:pPr>
             <w:r>
-              <w:t>arrangement.</w:t>
+              <w:t>Tel: Donlon 0123 4863559</w:t>
+            </w:r>
+          </w:p>
+          <w:p>
+            <w:pPr>
+              <w:pStyle w:val="TableRightColumn"/>
+            </w:pPr>
+            <w:r>
+              <w:t>Telefax: 0123 4863569</w:t>
             </w:r>
           </w:p>
         </w:tc>
@@ -2439,7 +2450,15 @@
               <w:pStyle w:val="TableRightColumn"/>
             </w:pPr>
             <w:r>
-              <w:t>1 snow blower; 2 snow ploughs; 2 scrapers; 1 sand spreader</w:t>
+              <w:t>Apron A, Asphalt, PCN 80/R/B/W/T</w:t>
+            </w:r>
+          </w:p>
+          <w:p>
+            <w:pPr>
+              <w:pStyle w:val="TableRightColumn"/>
+            </w:pPr>
+            <w:r>
+              <w:t>Apron B, Concrete, PCN 80/R/B/W/T</w:t>
             </w:r>
           </w:p>
         </w:tc>
@@ -2489,7 +2508,7 @@
               <w:pStyle w:val="TableRightColumn"/>
             </w:pPr>
             <w:r>
-              <w:t>1. Runway (RWY) 09L/27R and associated taxiway (TWY) to apron</w:t>
+              <w:t>TWY A, 23 M, Asphalt, PCN 80/R/B/W/T</w:t>
             </w:r>
           </w:p>
           <w:p>
@@ -2497,15 +2516,7 @@
               <w:pStyle w:val="TableRightColumn"/>
             </w:pPr>
             <w:r>
-              <w:t>2. RWY 09R/27L and TWY to apron</w:t>
-            </w:r>
-          </w:p>
-          <w:p>
-            <w:pPr>
-              <w:pStyle w:val="TableRightColumn"/>
-            </w:pPr>
-            <w:r>
-              <w:t>3. Other TWY and aircraft (ACFT) stands</w:t>
+              <w:t>TWY B, 20 M, Concrete, PCN 80/R/B/W/T</w:t>
             </w:r>
           </w:p>
         </w:tc>
@@ -2555,7 +2566,15 @@
               <w:pStyle w:val="TableRightColumn"/>
             </w:pPr>
             <w:r>
-              <w:t>Information on snow clearance published from November– April in NOTAM (SNOWTAM). See also the snow plan in section AD 1.2.2</w:t>
+              <w:t>Location: At Apron</w:t>
+            </w:r>
+          </w:p>
+          <w:p>
+            <w:pPr>
+              <w:pStyle w:val="TableRightColumn"/>
+            </w:pPr>
+            <w:r>
+              <w:t>Elevation: 28 M</w:t>
             </w:r>
           </w:p>
         </w:tc>
@@ -17710,14 +17729,15 @@
 <w:fonts xmlns:mc="http://schemas.openxmlformats.org/markup-compatibility/2006" xmlns:r="http://schemas.openxmlformats.org/officeDocument/2006/relationships" xmlns:w="http://schemas.openxmlformats.org/wordprocessingml/2006/main" xmlns:w14="http://schemas.microsoft.com/office/word/2010/wordml" xmlns:w15="http://schemas.microsoft.com/office/word/2012/wordml" xmlns:w16cex="http://schemas.microsoft.com/office/word/2018/wordml/cex" xmlns:w16cid="http://schemas.microsoft.com/office/word/2016/wordml/cid" xmlns:w16="http://schemas.microsoft.com/office/word/2018/wordml" xmlns:w16du="http://schemas.microsoft.com/office/word/2023/wordml/word16du" xmlns:w16sdtdh="http://schemas.microsoft.com/office/word/2020/wordml/sdtdatahash" xmlns:w16sdtfl="http://schemas.microsoft.com/office/word/2024/wordml/sdtformatlock" xmlns:w16se="http://schemas.microsoft.com/office/word/2015/wordml/symex" mc:Ignorable="w14 w15 w16se w16cid w16 w16cex w16sdtdh w16sdtfl w16du">
   <w:font w:name="Arial">
     <w:panose1 w:val="020B0604020202020204"/>
-    <w:charset w:val="A2"/>
+    <w:charset w:val="00"/>
     <w:family w:val="swiss"/>
     <w:pitch w:val="variable"/>
     <w:sig w:usb0="E0002EFF" w:usb1="C000785B" w:usb2="00000009" w:usb3="00000000" w:csb0="000001FF" w:csb1="00000000"/>
   </w:font>
   <w:font w:name="Times New Roman">
+    <w:altName w:val="Times New Roman"/>
     <w:panose1 w:val="02020603050405020304"/>
-    <w:charset w:val="A2"/>
+    <w:charset w:val="00"/>
     <w:family w:val="roman"/>
     <w:pitch w:val="variable"/>
     <w:sig w:usb0="E0002EFF" w:usb1="C000785B" w:usb2="00000009" w:usb3="00000000" w:csb0="000001FF" w:csb1="00000000"/>
@@ -17755,9 +17775,11 @@
     <w:rsidRoot w:val="00D556A7"/>
     <w:rsid w:val="00025E7D"/>
     <w:rsid w:val="00260533"/>
+    <w:rsid w:val="00277EFC"/>
     <w:rsid w:val="003B435B"/>
     <w:rsid w:val="00497D21"/>
     <w:rsid w:val="005637A0"/>
+    <w:rsid w:val="00574C54"/>
     <w:rsid w:val="005D275A"/>
     <w:rsid w:val="006C7948"/>
     <w:rsid w:val="0087700E"/>
@@ -17782,7 +17804,7 @@
   <w:themeFontLang w:val="en-US"/>
   <w:clrSchemeMapping w:bg1="light1" w:t1="dark1" w:bg2="light2" w:t2="dark2" w:accent1="accent1" w:accent2="accent2" w:accent3="accent3" w:accent4="accent4" w:accent5="accent5" w:accent6="accent6" w:hyperlink="hyperlink" w:followedHyperlink="followedHyperlink"/>
   <w:decimalSymbol w:val="."/>
-  <w:listSeparator w:val=";"/>
+  <w:listSeparator w:val=","/>
   <w15:chartTrackingRefBased/>
 </w:settings>
 </file>

</xml_diff>